<commit_message>
Add FYP interim report, report guidelines, and project introduction; update roadmap
Adds the interim report, the CCDS FYP report/oral guidelines, and the
project introduction write-up to the repository alongside the existing
SRS and design documents. Updates FYP Roadmap.docx (formatting cleanup).

Co-Authored-By: Claude Sonnet 5.5 <noreply@anthropic.com>
</commit_message>
<xml_diff>
--- a/FYP Roadmap.docx
+++ b/FYP Roadmap.docx
@@ -1,6 +1,6 @@
 
 <file path=word/document.xml><?xml version="1.0" encoding="utf-8"?>
-<w:document xmlns:wpc="http://schemas.microsoft.com/office/word/2010/wordprocessingCanvas" xmlns:cx="http://schemas.microsoft.com/office/drawing/2014/chartex" xmlns:cx1="http://schemas.microsoft.com/office/drawing/2015/9/8/chartex" xmlns:cx2="http://schemas.microsoft.com/office/drawing/2015/10/21/chartex" xmlns:cx3="http://schemas.microsoft.com/office/drawing/2016/5/9/chartex" xmlns:cx4="http://schemas.microsoft.com/office/drawing/2016/5/10/chartex" xmlns:cx5="http://schemas.microsoft.com/office/drawing/2016/5/11/chartex" xmlns:cx6="http://schemas.microsoft.com/office/drawing/2016/5/12/chartex" xmlns:cx7="http://schemas.microsoft.com/office/drawing/2016/5/13/chartex" xmlns:cx8="http://schemas.microsoft.com/office/drawing/2016/5/14/chartex" xmlns:mc="http://schemas.openxmlformats.org/markup-compatibility/2006" xmlns:aink="http://schemas.microsoft.com/office/drawing/2016/ink" xmlns:am3d="http://schemas.microsoft.com/office/drawing/2017/model3d" xmlns:o="urn:schemas-microsoft-com:office:office" xmlns:oel="http://schemas.microsoft.com/office/2019/extlst" xmlns:r="http://schemas.openxmlformats.org/officeDocument/2006/relationships" xmlns:m="http://schemas.openxmlformats.org/officeDocument/2006/math" xmlns:v="urn:schemas-microsoft-com:vml" xmlns:wp14="http://schemas.microsoft.com/office/word/2010/wordprocessingDrawing" xmlns:wp="http://schemas.openxmlformats.org/drawingml/2006/wordprocessingDrawing" xmlns:w10="urn:schemas-microsoft-com:office:word" xmlns:w="http://schemas.openxmlformats.org/wordprocessingml/2006/main" xmlns:w14="http://schemas.microsoft.com/office/word/2010/wordml" xmlns:w15="http://schemas.microsoft.com/office/word/2012/wordml" xmlns:w16cex="http://schemas.microsoft.com/office/word/2018/wordml/cex" xmlns:w16cid="http://schemas.microsoft.com/office/word/2016/wordml/cid" xmlns:w16="http://schemas.microsoft.com/office/word/2018/wordml" xmlns:w16du="http://schemas.microsoft.com/office/word/2023/wordml/word16du" xmlns:w16sdtdh="http://schemas.microsoft.com/office/word/2020/wordml/sdtdatahash" xmlns:w16sdtfl="http://schemas.microsoft.com/office/word/2024/wordml/sdtformatlock" xmlns:w16se="http://schemas.microsoft.com/office/word/2015/wordml/symex" xmlns:wpg="http://schemas.microsoft.com/office/word/2010/wordprocessingGroup" xmlns:wpi="http://schemas.microsoft.com/office/word/2010/wordprocessingInk" xmlns:wne="http://schemas.microsoft.com/office/word/2006/wordml" xmlns:wps="http://schemas.microsoft.com/office/word/2010/wordprocessingShape" mc:Ignorable="w14 w15 w16se w16cid w16 w16cex w16sdtdh w16sdtfl w16du wp14">
+<w:document xmlns:wpc="http://schemas.microsoft.com/office/word/2010/wordprocessingCanvas" xmlns:cx="http://schemas.microsoft.com/office/drawing/2014/chartex" xmlns:cx1="http://schemas.microsoft.com/office/drawing/2015/9/8/chartex" xmlns:cx2="http://schemas.microsoft.com/office/drawing/2015/10/21/chartex" xmlns:cx3="http://schemas.microsoft.com/office/drawing/2016/5/9/chartex" xmlns:cx4="http://schemas.microsoft.com/office/drawing/2016/5/10/chartex" xmlns:cx5="http://schemas.microsoft.com/office/drawing/2016/5/11/chartex" xmlns:cx6="http://schemas.microsoft.com/office/drawing/2016/5/12/chartex" xmlns:cx7="http://schemas.microsoft.com/office/drawing/2016/5/13/chartex" xmlns:cx8="http://schemas.microsoft.com/office/drawing/2016/5/14/chartex" xmlns:mc="http://schemas.openxmlformats.org/markup-compatibility/2006" xmlns:aink="http://schemas.microsoft.com/office/drawing/2016/ink" xmlns:am3d="http://schemas.microsoft.com/office/drawing/2017/model3d" xmlns:o="urn:schemas-microsoft-com:office:office" xmlns:oel="http://schemas.microsoft.com/office/2019/extlst" xmlns:r="http://schemas.openxmlformats.org/officeDocument/2006/relationships" xmlns:m="http://schemas.openxmlformats.org/officeDocument/2006/math" xmlns:v="urn:schemas-microsoft-com:vml" xmlns:wp14="http://schemas.microsoft.com/office/word/2010/wordprocessingDrawing" xmlns:wp="http://schemas.openxmlformats.org/drawingml/2006/wordprocessingDrawing" xmlns:w10="urn:schemas-microsoft-com:office:word" xmlns:w="http://schemas.openxmlformats.org/wordprocessingml/2006/main" xmlns:w14="http://schemas.microsoft.com/office/word/2010/wordml" xmlns:w15="http://schemas.microsoft.com/office/word/2012/wordml" xmlns:w16cei="http://schemas.microsoft.com/office/word/2026/wordml/cei" xmlns:w16cex="http://schemas.microsoft.com/office/word/2018/wordml/cex" xmlns:w16cid="http://schemas.microsoft.com/office/word/2016/wordml/cid" xmlns:w16="http://schemas.microsoft.com/office/word/2018/wordml" xmlns:w16du="http://schemas.microsoft.com/office/word/2023/wordml/word16du" xmlns:w16sdtdh="http://schemas.microsoft.com/office/word/2020/wordml/sdtdatahash" xmlns:w16sdtfl="http://schemas.microsoft.com/office/word/2024/wordml/sdtformatlock" xmlns:w16se="http://schemas.microsoft.com/office/word/2015/wordml/symex" xmlns:wpg="http://schemas.microsoft.com/office/word/2010/wordprocessingGroup" xmlns:wpi="http://schemas.microsoft.com/office/word/2010/wordprocessingInk" xmlns:wne="http://schemas.microsoft.com/office/word/2006/wordml" xmlns:wps="http://schemas.microsoft.com/office/word/2010/wordprocessingShape" mc:Ignorable="w14 w15 w16se w16cid w16 w16cex w16sdtdh w16sdtfl w16du wp14">
   <w:body>
     <w:p>
       <w:pPr>
@@ -43,7 +43,7 @@
           <w:b/>
           <w:bCs/>
         </w:rPr>
-        <w:t>) · Lab #1 alignment</w:t>
+        <w:t xml:space="preserve">) </w:t>
       </w:r>
     </w:p>
     <w:p>
@@ -115,7 +115,7 @@
           <w:b/>
           <w:bCs/>
         </w:rPr>
-        <w:t>) · Lab #2 alignment</w:t>
+        <w:t xml:space="preserve">) </w:t>
       </w:r>
     </w:p>
     <w:p>
@@ -155,7 +155,10 @@
         <w:t>Decide and document the simulation algorithm</w:t>
       </w:r>
       <w:r>
-        <w:t xml:space="preserve"> (see §3 below) — this is the single most important technical decision in the project and needs to be locked before design</w:t>
+        <w:t xml:space="preserve"> - </w:t>
+      </w:r>
+      <w:r>
+        <w:t>this is the single most important technical decision in the project and needs to be locked before design</w:t>
       </w:r>
     </w:p>
     <w:p>
@@ -195,7 +198,7 @@
           <w:b/>
           <w:bCs/>
         </w:rPr>
-        <w:t>) · Lab #3 alignment</w:t>
+        <w:t xml:space="preserve">) </w:t>
       </w:r>
     </w:p>
     <w:p>
@@ -206,7 +209,13 @@
         </w:numPr>
       </w:pPr>
       <w:r>
-        <w:t>Design class diagram (map analysis classes → design classes, add control/container classes)</w:t>
+        <w:t xml:space="preserve">Design class diagram (map analysis classes </w:t>
+      </w:r>
+      <w:r>
+        <w:t>-</w:t>
+      </w:r>
+      <w:r>
+        <w:t xml:space="preserve"> design classes, add control/container classes)</w:t>
       </w:r>
     </w:p>
     <w:p>
@@ -217,7 +226,19 @@
         </w:numPr>
       </w:pPr>
       <w:r>
-        <w:t>System architecture: mobile client ↔ REST API ↔ Postgres</w:t>
+        <w:t xml:space="preserve">System architecture: mobile client </w:t>
+      </w:r>
+      <w:r>
+        <w:t>-</w:t>
+      </w:r>
+      <w:r>
+        <w:t xml:space="preserve"> REST API </w:t>
+      </w:r>
+      <w:r>
+        <w:t>-</w:t>
+      </w:r>
+      <w:r>
+        <w:t xml:space="preserve"> Postgres</w:t>
       </w:r>
     </w:p>
     <w:p>
@@ -257,7 +278,7 @@
         </w:numPr>
       </w:pPr>
       <w:r>
-        <w:t>Tech stack decision + project skeleton scaffolded (see §3)</w:t>
+        <w:t>Tech stack decision + project skeleton scaffolded</w:t>
       </w:r>
     </w:p>
     <w:p>
@@ -283,7 +304,23 @@
           <w:b/>
           <w:bCs/>
         </w:rPr>
-        <w:t>Phase 3 — Core Implementation, Round 1 (</w:t>
+        <w:t xml:space="preserve">Phase 3 — Core Implementation, </w:t>
+      </w:r>
+      <w:proofErr w:type="gramStart"/>
+      <w:r>
+        <w:rPr>
+          <w:b/>
+          <w:bCs/>
+        </w:rPr>
+        <w:t>Round</w:t>
+      </w:r>
+      <w:proofErr w:type="gramEnd"/>
+      <w:r>
+        <w:rPr>
+          <w:b/>
+          <w:bCs/>
+        </w:rPr>
+        <w:t xml:space="preserve"> 1 (</w:t>
       </w:r>
       <w:r>
         <w:rPr>
@@ -308,7 +345,13 @@
         </w:numPr>
       </w:pPr>
       <w:r>
-        <w:t>Auth (register/login, password hashing) — FR01, FR02, NFR-06</w:t>
+        <w:t xml:space="preserve">Auth (register/login, password hashing) </w:t>
+      </w:r>
+      <w:r>
+        <w:t>-</w:t>
+      </w:r>
+      <w:r>
+        <w:t xml:space="preserve"> FR01, FR02, NFR-06</w:t>
       </w:r>
     </w:p>
     <w:p>
@@ -319,7 +362,13 @@
         </w:numPr>
       </w:pPr>
       <w:r>
-        <w:t>Profile setup + budget-band derivation — FR03</w:t>
+        <w:t>Profile setup + budget-band derivation</w:t>
+      </w:r>
+      <w:r>
+        <w:t xml:space="preserve"> -</w:t>
+      </w:r>
+      <w:r>
+        <w:t xml:space="preserve"> FR03</w:t>
       </w:r>
     </w:p>
     <w:p>
@@ -330,7 +379,13 @@
         </w:numPr>
       </w:pPr>
       <w:r>
-        <w:t>Portfolio template CRUD (seed data) — FR04</w:t>
+        <w:t xml:space="preserve">Portfolio template CRUD (seed data) </w:t>
+      </w:r>
+      <w:r>
+        <w:t xml:space="preserve">- </w:t>
+      </w:r>
+      <w:r>
+        <w:t>FR04</w:t>
       </w:r>
     </w:p>
     <w:p>
@@ -381,8 +436,31 @@
         </w:numPr>
       </w:pPr>
       <w:r>
+        <w:t>Simulation configuration + validation</w:t>
+      </w:r>
+      <w:r>
+        <w:t xml:space="preserve"> -</w:t>
+      </w:r>
+      <w:r>
+        <w:t xml:space="preserve"> FR05</w:t>
+      </w:r>
+    </w:p>
+    <w:p>
+      <w:pPr>
+        <w:numPr>
+          <w:ilvl w:val="0"/>
+          <w:numId w:val="5"/>
+        </w:numPr>
+      </w:pPr>
+      <w:r>
         <w:lastRenderedPageBreak/>
-        <w:t>Simulation configuration + validation — FR05</w:t>
+        <w:t>Deterministic portfolio value time-series calculation</w:t>
+      </w:r>
+      <w:r>
+        <w:t xml:space="preserve"> - </w:t>
+      </w:r>
+      <w:r>
+        <w:t>FR06</w:t>
       </w:r>
     </w:p>
     <w:p>
@@ -393,7 +471,13 @@
         </w:numPr>
       </w:pPr>
       <w:r>
-        <w:t>Deterministic portfolio value time-series calculation — FR06</w:t>
+        <w:t xml:space="preserve">Contribution persistence </w:t>
+      </w:r>
+      <w:r>
+        <w:t xml:space="preserve">- </w:t>
+      </w:r>
+      <w:r>
+        <w:t>FR07</w:t>
       </w:r>
     </w:p>
     <w:p>
@@ -404,7 +488,14 @@
         </w:numPr>
       </w:pPr>
       <w:r>
-        <w:t>Contribution persistence — FR07</w:t>
+        <w:rPr>
+          <w:b/>
+          <w:bCs/>
+        </w:rPr>
+        <w:t>black-box (equivalence class/boundary value) test target</w:t>
+      </w:r>
+      <w:r>
+        <w:t>, clear numeric input ranges (amount, frequency, duration)</w:t>
       </w:r>
     </w:p>
     <w:p>
@@ -415,27 +506,6 @@
         </w:numPr>
       </w:pPr>
       <w:r>
-        <w:t xml:space="preserve">This is a strong candidate for your </w:t>
-      </w:r>
-      <w:r>
-        <w:rPr>
-          <w:b/>
-          <w:bCs/>
-        </w:rPr>
-        <w:t>black-box (equivalence class/boundary value) test target</w:t>
-      </w:r>
-      <w:r>
-        <w:t xml:space="preserve"> in Lab #4, since it has clear numeric input ranges (amount, frequency, duration)</w:t>
-      </w:r>
-    </w:p>
-    <w:p>
-      <w:pPr>
-        <w:numPr>
-          <w:ilvl w:val="0"/>
-          <w:numId w:val="5"/>
-        </w:numPr>
-      </w:pPr>
-      <w:r>
         <w:t>Deliverable: simulation engine + test suite, dashboard can display real data — FR08</w:t>
       </w:r>
     </w:p>
@@ -476,7 +546,13 @@
         </w:numPr>
       </w:pPr>
       <w:r>
-        <w:t>Peer group assignment logic — FR09</w:t>
+        <w:t>Peer group assignment logic</w:t>
+      </w:r>
+      <w:r>
+        <w:t xml:space="preserve"> - </w:t>
+      </w:r>
+      <w:r>
+        <w:t>FR09</w:t>
       </w:r>
     </w:p>
     <w:p>
@@ -487,7 +563,13 @@
         </w:numPr>
       </w:pPr>
       <w:r>
-        <w:t>Aggregate stats (median, percentiles) computation — FR10</w:t>
+        <w:t>Aggregate stats (median, percentiles) computation</w:t>
+      </w:r>
+      <w:r>
+        <w:t xml:space="preserve"> - </w:t>
+      </w:r>
+      <w:r>
+        <w:t>FR10</w:t>
       </w:r>
     </w:p>
     <w:p>
@@ -498,7 +580,13 @@
         </w:numPr>
       </w:pPr>
       <w:r>
-        <w:t>Percentile comparison endpoint — FR11</w:t>
+        <w:t>Percentile comparison endpoint</w:t>
+      </w:r>
+      <w:r>
+        <w:t xml:space="preserve"> - </w:t>
+      </w:r>
+      <w:r>
+        <w:t>FR11</w:t>
       </w:r>
     </w:p>
     <w:p>
@@ -509,7 +597,13 @@
         </w:numPr>
       </w:pPr>
       <w:r>
-        <w:t>Small-group fallback (relax grouping rules) — UC-05 exception</w:t>
+        <w:t>Small-group fallback (relax grouping rules)</w:t>
+      </w:r>
+      <w:r>
+        <w:t xml:space="preserve"> - </w:t>
+      </w:r>
+      <w:r>
+        <w:t>UC-05 exception</w:t>
       </w:r>
     </w:p>
     <w:p>
@@ -520,9 +614,6 @@
         </w:numPr>
       </w:pPr>
       <w:r>
-        <w:t xml:space="preserve">This is your </w:t>
-      </w:r>
-      <w:r>
         <w:rPr>
           <w:b/>
           <w:bCs/>
@@ -530,7 +621,7 @@
         <w:t>basis-path testing target</w:t>
       </w:r>
       <w:r>
-        <w:t xml:space="preserve"> (two methods with complex branching logic) for Lab #4</w:t>
+        <w:t xml:space="preserve"> (two methods with complex branching logic)</w:t>
       </w:r>
     </w:p>
     <w:p>
@@ -581,7 +672,13 @@
         </w:numPr>
       </w:pPr>
       <w:r>
-        <w:t>Rule-based insight cards from user-vs-peer gaps — FR12</w:t>
+        <w:t>Rule-based insight cards from user-vs-peer gaps</w:t>
+      </w:r>
+      <w:r>
+        <w:t xml:space="preserve"> - </w:t>
+      </w:r>
+      <w:r>
+        <w:t>FR12</w:t>
       </w:r>
     </w:p>
     <w:p>
@@ -592,7 +689,13 @@
         </w:numPr>
       </w:pPr>
       <w:r>
-        <w:t>Positive-reinforcement fallback path — UC-06 alt flow</w:t>
+        <w:t>Positive-reinforcement fallback path</w:t>
+      </w:r>
+      <w:r>
+        <w:t xml:space="preserve"> - </w:t>
+      </w:r>
+      <w:r>
+        <w:t>UC-06 alt flow</w:t>
       </w:r>
     </w:p>
     <w:p>
@@ -643,7 +746,13 @@
         </w:numPr>
       </w:pPr>
       <w:r>
-        <w:t>Simulation history — FR13</w:t>
+        <w:t>Simulation history</w:t>
+      </w:r>
+      <w:r>
+        <w:t xml:space="preserve"> - </w:t>
+      </w:r>
+      <w:r>
+        <w:t>FR13</w:t>
       </w:r>
     </w:p>
     <w:p>
@@ -705,7 +814,7 @@
           <w:b/>
           <w:bCs/>
         </w:rPr>
-        <w:t>) · Lab #4 alignment</w:t>
+        <w:t>)</w:t>
       </w:r>
     </w:p>
     <w:p>
@@ -738,37 +847,67 @@
         </w:numPr>
       </w:pPr>
       <w:r>
+        <w:t>Deliverable: test cases + results, reflection report</w:t>
+      </w:r>
+    </w:p>
+    <w:p>
+      <w:pPr>
+        <w:rPr>
+          <w:b/>
+          <w:bCs/>
+        </w:rPr>
+      </w:pPr>
+      <w:r>
+        <w:rPr>
+          <w:b/>
+          <w:bCs/>
+        </w:rPr>
+        <w:t>Phase 9 — Demo Prep &amp; Submission (</w:t>
+      </w:r>
+      <w:r>
+        <w:rPr>
+          <w:b/>
+          <w:bCs/>
+        </w:rPr>
+        <w:t>October</w:t>
+      </w:r>
+      <w:r>
+        <w:rPr>
+          <w:b/>
+          <w:bCs/>
+        </w:rPr>
+        <w:t>)</w:t>
+      </w:r>
+    </w:p>
+    <w:p>
+      <w:pPr>
+        <w:numPr>
+          <w:ilvl w:val="0"/>
+          <w:numId w:val="10"/>
+        </w:numPr>
+      </w:pPr>
+      <w:r>
+        <w:t>Finalize SRS/UC/class diagram/dialog map to match final code</w:t>
+      </w:r>
+    </w:p>
+    <w:p>
+      <w:pPr>
+        <w:numPr>
+          <w:ilvl w:val="0"/>
+          <w:numId w:val="10"/>
+        </w:numPr>
+      </w:pPr>
+      <w:r>
         <w:lastRenderedPageBreak/>
-        <w:t>Deliverable: test cases + results, reflection report</w:t>
-      </w:r>
-    </w:p>
-    <w:p>
-      <w:pPr>
-        <w:rPr>
-          <w:b/>
-          <w:bCs/>
-        </w:rPr>
-      </w:pPr>
-      <w:r>
-        <w:rPr>
-          <w:b/>
-          <w:bCs/>
-        </w:rPr>
-        <w:t>Phase 9 — Demo Prep &amp; Submission (</w:t>
-      </w:r>
-      <w:r>
-        <w:rPr>
-          <w:b/>
-          <w:bCs/>
-        </w:rPr>
-        <w:t>October</w:t>
-      </w:r>
-      <w:r>
-        <w:rPr>
-          <w:b/>
-          <w:bCs/>
-        </w:rPr>
-        <w:t>) · Lab #5 alignment</w:t>
+        <w:t xml:space="preserve">Demo script (13–15 min </w:t>
+      </w:r>
+      <w:proofErr w:type="gramStart"/>
+      <w:r>
+        <w:t>live</w:t>
+      </w:r>
+      <w:proofErr w:type="gramEnd"/>
+      <w:r>
+        <w:t xml:space="preserve"> + highlights)</w:t>
       </w:r>
     </w:p>
     <w:p>
@@ -779,56 +918,7 @@
         </w:numPr>
       </w:pPr>
       <w:r>
-        <w:t>Finalize SRS/UC/class diagram/dialog map to match final code</w:t>
-      </w:r>
-    </w:p>
-    <w:p>
-      <w:pPr>
-        <w:numPr>
-          <w:ilvl w:val="0"/>
-          <w:numId w:val="10"/>
-        </w:numPr>
-      </w:pPr>
-      <w:r>
-        <w:t>Demo script (13–15 min live + highlights)</w:t>
-      </w:r>
-    </w:p>
-    <w:p>
-      <w:pPr>
-        <w:numPr>
-          <w:ilvl w:val="0"/>
-          <w:numId w:val="10"/>
-        </w:numPr>
-      </w:pPr>
-      <w:r>
-        <w:t>5–7 min screen-recorded demo video</w:t>
-      </w:r>
-    </w:p>
-    <w:p>
-      <w:pPr>
-        <w:numPr>
-          <w:ilvl w:val="0"/>
-          <w:numId w:val="10"/>
-        </w:numPr>
-      </w:pPr>
-      <w:r>
         <w:t>Deliverable: full submission package</w:t>
-      </w:r>
-    </w:p>
-    <w:p>
-      <w:r>
-        <w:pict w14:anchorId="50A2FF5F">
-          <v:rect id="_x0000_i1025" style="width:0;height:1.5pt" o:hralign="center" o:hrstd="t" o:hr="t" fillcolor="#a0a0a0" stroked="f"/>
-        </w:pict>
-      </w:r>
-    </w:p>
-    <w:p>
-      <w:r>
-        <w:rPr>
-          <w:i/>
-          <w:iCs/>
-        </w:rPr>
-        <w:t>Timeline assumes ~20 working weeks; compress/stretch phases 3–7 to fit your actual semester calendar. Phases 4 and 5 are the highest-risk items — start those algorithm design conversations early even if implementation comes later.</w:t>
       </w:r>
     </w:p>
     <w:p/>
@@ -843,7 +933,7 @@
 </file>
 
 <file path=word/numbering.xml><?xml version="1.0" encoding="utf-8"?>
-<w:numbering xmlns:wpc="http://schemas.microsoft.com/office/word/2010/wordprocessingCanvas" xmlns:cx="http://schemas.microsoft.com/office/drawing/2014/chartex" xmlns:cx1="http://schemas.microsoft.com/office/drawing/2015/9/8/chartex" xmlns:cx2="http://schemas.microsoft.com/office/drawing/2015/10/21/chartex" xmlns:cx3="http://schemas.microsoft.com/office/drawing/2016/5/9/chartex" xmlns:cx4="http://schemas.microsoft.com/office/drawing/2016/5/10/chartex" xmlns:cx5="http://schemas.microsoft.com/office/drawing/2016/5/11/chartex" xmlns:cx6="http://schemas.microsoft.com/office/drawing/2016/5/12/chartex" xmlns:cx7="http://schemas.microsoft.com/office/drawing/2016/5/13/chartex" xmlns:cx8="http://schemas.microsoft.com/office/drawing/2016/5/14/chartex" xmlns:mc="http://schemas.openxmlformats.org/markup-compatibility/2006" xmlns:aink="http://schemas.microsoft.com/office/drawing/2016/ink" xmlns:am3d="http://schemas.microsoft.com/office/drawing/2017/model3d" xmlns:o="urn:schemas-microsoft-com:office:office" xmlns:oel="http://schemas.microsoft.com/office/2019/extlst" xmlns:r="http://schemas.openxmlformats.org/officeDocument/2006/relationships" xmlns:m="http://schemas.openxmlformats.org/officeDocument/2006/math" xmlns:v="urn:schemas-microsoft-com:vml" xmlns:wp14="http://schemas.microsoft.com/office/word/2010/wordprocessingDrawing" xmlns:wp="http://schemas.openxmlformats.org/drawingml/2006/wordprocessingDrawing" xmlns:w10="urn:schemas-microsoft-com:office:word" xmlns:w="http://schemas.openxmlformats.org/wordprocessingml/2006/main" xmlns:w14="http://schemas.microsoft.com/office/word/2010/wordml" xmlns:w15="http://schemas.microsoft.com/office/word/2012/wordml" xmlns:w16cex="http://schemas.microsoft.com/office/word/2018/wordml/cex" xmlns:w16cid="http://schemas.microsoft.com/office/word/2016/wordml/cid" xmlns:w16="http://schemas.microsoft.com/office/word/2018/wordml" xmlns:w16du="http://schemas.microsoft.com/office/word/2023/wordml/word16du" xmlns:w16sdtdh="http://schemas.microsoft.com/office/word/2020/wordml/sdtdatahash" xmlns:w16sdtfl="http://schemas.microsoft.com/office/word/2024/wordml/sdtformatlock" xmlns:w16se="http://schemas.microsoft.com/office/word/2015/wordml/symex" xmlns:wpg="http://schemas.microsoft.com/office/word/2010/wordprocessingGroup" xmlns:wpi="http://schemas.microsoft.com/office/word/2010/wordprocessingInk" xmlns:wne="http://schemas.microsoft.com/office/word/2006/wordml" xmlns:wps="http://schemas.microsoft.com/office/word/2010/wordprocessingShape" mc:Ignorable="w14 w15 w16se w16cid w16 w16cex w16sdtdh w16sdtfl w16du wp14">
+<w:numbering xmlns:wpc="http://schemas.microsoft.com/office/word/2010/wordprocessingCanvas" xmlns:cx="http://schemas.microsoft.com/office/drawing/2014/chartex" xmlns:cx1="http://schemas.microsoft.com/office/drawing/2015/9/8/chartex" xmlns:cx2="http://schemas.microsoft.com/office/drawing/2015/10/21/chartex" xmlns:cx3="http://schemas.microsoft.com/office/drawing/2016/5/9/chartex" xmlns:cx4="http://schemas.microsoft.com/office/drawing/2016/5/10/chartex" xmlns:cx5="http://schemas.microsoft.com/office/drawing/2016/5/11/chartex" xmlns:cx6="http://schemas.microsoft.com/office/drawing/2016/5/12/chartex" xmlns:cx7="http://schemas.microsoft.com/office/drawing/2016/5/13/chartex" xmlns:cx8="http://schemas.microsoft.com/office/drawing/2016/5/14/chartex" xmlns:mc="http://schemas.openxmlformats.org/markup-compatibility/2006" xmlns:aink="http://schemas.microsoft.com/office/drawing/2016/ink" xmlns:am3d="http://schemas.microsoft.com/office/drawing/2017/model3d" xmlns:o="urn:schemas-microsoft-com:office:office" xmlns:oel="http://schemas.microsoft.com/office/2019/extlst" xmlns:r="http://schemas.openxmlformats.org/officeDocument/2006/relationships" xmlns:m="http://schemas.openxmlformats.org/officeDocument/2006/math" xmlns:v="urn:schemas-microsoft-com:vml" xmlns:wp14="http://schemas.microsoft.com/office/word/2010/wordprocessingDrawing" xmlns:wp="http://schemas.openxmlformats.org/drawingml/2006/wordprocessingDrawing" xmlns:w10="urn:schemas-microsoft-com:office:word" xmlns:w="http://schemas.openxmlformats.org/wordprocessingml/2006/main" xmlns:w14="http://schemas.microsoft.com/office/word/2010/wordml" xmlns:w15="http://schemas.microsoft.com/office/word/2012/wordml" xmlns:w16cei="http://schemas.microsoft.com/office/word/2026/wordml/cei" xmlns:w16cex="http://schemas.microsoft.com/office/word/2018/wordml/cex" xmlns:w16cid="http://schemas.microsoft.com/office/word/2016/wordml/cid" xmlns:w16="http://schemas.microsoft.com/office/word/2018/wordml" xmlns:w16du="http://schemas.microsoft.com/office/word/2023/wordml/word16du" xmlns:w16sdtdh="http://schemas.microsoft.com/office/word/2020/wordml/sdtdatahash" xmlns:w16sdtfl="http://schemas.microsoft.com/office/word/2024/wordml/sdtformatlock" xmlns:w16se="http://schemas.microsoft.com/office/word/2015/wordml/symex" xmlns:wpg="http://schemas.microsoft.com/office/word/2010/wordprocessingGroup" xmlns:wpi="http://schemas.microsoft.com/office/word/2010/wordprocessingInk" xmlns:wne="http://schemas.microsoft.com/office/word/2006/wordml" xmlns:wps="http://schemas.microsoft.com/office/word/2010/wordprocessingShape" mc:Ignorable="w14 w15 w16se w16cid w16 w16cex w16sdtdh w16sdtfl w16du wp14">
   <w:abstractNum w:abstractNumId="0" w15:restartNumberingAfterBreak="0">
     <w:nsid w:val="053F7CEC"/>
     <w:multiLevelType w:val="multilevel"/>

</xml_diff>